<commit_message>
book: rapikan struktur (hapus cover duplikat & halaman kosong, mini-TOC jadi intro, klaim basi dikoreksi, gambar 1-26)
</commit_message>
<xml_diff>
--- a/book/BUKU-LENGKAP-Hardware-Firmware-IoT-Hacking.docx
+++ b/book/BUKU-LENGKAP-Hardware-Firmware-IoT-Hacking.docx
@@ -3,11 +3,6 @@
 <w:document xmlns:wpc="http://schemas.microsoft.com/office/word/2010/wordprocessingCanvas" xmlns:mo="http://schemas.microsoft.com/office/mac/office/2008/main" xmlns:mc="http://schemas.openxmlformats.org/markup-compatibility/2006" xmlns:mv="urn:schemas-microsoft-com:mac:vml" xmlns:o="urn:schemas-microsoft-com:office:office" xmlns:r="http://schemas.openxmlformats.org/officeDocument/2006/relationships" xmlns:m="http://schemas.openxmlformats.org/officeDocument/2006/math" xmlns:v="urn:schemas-microsoft-com:vml" xmlns:wp14="http://schemas.microsoft.com/office/word/2010/wordprocessingDrawing" xmlns:wp="http://schemas.openxmlformats.org/drawingml/2006/wordprocessingDrawing" xmlns:w10="urn:schemas-microsoft-com:office:word" xmlns:w="http://schemas.openxmlformats.org/wordprocessingml/2006/main" xmlns:w14="http://schemas.microsoft.com/office/word/2010/wordml" xmlns:wpg="http://schemas.microsoft.com/office/word/2010/wordprocessingGroup" xmlns:wpi="http://schemas.microsoft.com/office/word/2010/wordprocessingInk" xmlns:wne="http://schemas.microsoft.com/office/word/2006/wordml" xmlns:wps="http://schemas.microsoft.com/office/word/2010/wordprocessingShape" mc:Ignorable="w14 wp14">
   <w:body>
     <w:p/>
-    <w:p/>
-    <w:p/>
-    <w:p/>
-    <w:p/>
-    <w:p/>
     <w:p>
       <w:pPr>
         <w:pStyle w:val="Heading1"/>
@@ -39,39 +34,6 @@
     <w:p>
       <w:r>
         <w:br w:type="page"/>
-      </w:r>
-    </w:p>
-    <w:p>
-      <w:pPr>
-        <w:pStyle w:val="Title"/>
-        <w:jc w:val="center"/>
-      </w:pPr>
-      <w:r>
-        <w:t>Buku Belajar: Hardware, Firmware &amp; IoT Hacking</w:t>
-      </w:r>
-    </w:p>
-    <w:p>
-      <w:pPr>
-        <w:jc w:val="center"/>
-      </w:pPr>
-      <w:r>
-        <w:rPr>
-          <w:b/>
-          <w:sz w:val="30"/>
-        </w:rPr>
-        <w:t>Studi Kasus Live: Router Tenda AC6 v2 (Realtek RTL8197F)</w:t>
-      </w:r>
-    </w:p>
-    <w:p>
-      <w:pPr>
-        <w:jc w:val="center"/>
-      </w:pPr>
-      <w:r>
-        <w:rPr>
-          <w:i/>
-          <w:sz w:val="22"/>
-        </w:rPr>
-        <w:t>Dari recon sampai analisis firmware — paham langkah, alasan, dan pola celahnya</w:t>
       </w:r>
     </w:p>
     <w:p/>
@@ -302,258 +264,7 @@
     </w:p>
     <w:p>
       <w:r>
-        <w:rPr>
-          <w:b/>
-        </w:rPr>
-        <w:t>BAGIAN 0 — Cara Memakai Buku Ini</w:t>
-      </w:r>
-    </w:p>
-    <w:p>
-      <w:r>
-        <w:rPr>
-          <w:b/>
-        </w:rPr>
-        <w:t>BAGIAN I — FONDASI</w:t>
-      </w:r>
-    </w:p>
-    <w:p>
-      <w:pPr>
-        <w:pStyle w:val="ListBullet"/>
-      </w:pPr>
-      <w:r>
-        <w:t xml:space="preserve">  1. Hardware vs Firmware vs IoT Hacking</w:t>
-      </w:r>
-    </w:p>
-    <w:p>
-      <w:pPr>
-        <w:pStyle w:val="ListBullet"/>
-      </w:pPr>
-      <w:r>
-        <w:t xml:space="preserve">  2. Mindset &amp; Metodologi</w:t>
-      </w:r>
-    </w:p>
-    <w:p>
-      <w:pPr>
-        <w:pStyle w:val="ListBullet"/>
-      </w:pPr>
-      <w:r>
-        <w:t xml:space="preserve">  3. Anatomi Sebuah Router</w:t>
-      </w:r>
-    </w:p>
-    <w:p>
-      <w:r>
-        <w:rPr>
-          <w:b/>
-        </w:rPr>
-        <w:t>BAGIAN II — RECON &amp; WEB (STUDI KASUS TENDA)</w:t>
-      </w:r>
-    </w:p>
-    <w:p>
-      <w:pPr>
-        <w:pStyle w:val="ListBullet"/>
-      </w:pPr>
-      <w:r>
-        <w:t xml:space="preserve">  4. Fingerprinting: Mengenal Target</w:t>
-      </w:r>
-    </w:p>
-    <w:p>
-      <w:pPr>
-        <w:pStyle w:val="ListBullet"/>
-      </w:pPr>
-      <w:r>
-        <w:t xml:space="preserve">  5. Port Scanning &amp; Service Enumeration</w:t>
-      </w:r>
-    </w:p>
-    <w:p>
-      <w:pPr>
-        <w:pStyle w:val="ListBullet"/>
-      </w:pPr>
-      <w:r>
-        <w:t xml:space="preserve">  6. Web Enumeration: Menemukan Endpoint &amp; Kebocoran</w:t>
-      </w:r>
-    </w:p>
-    <w:p>
-      <w:pPr>
-        <w:pStyle w:val="ListBullet"/>
-      </w:pPr>
-      <w:r>
-        <w:t xml:space="preserve">  7. Autentikasi &amp; Session</w:t>
-      </w:r>
-    </w:p>
-    <w:p>
-      <w:r>
-        <w:rPr>
-          <w:b/>
-        </w:rPr>
-        <w:t>BAGIAN III — KELAS KERENTANAN &amp; POLA</w:t>
-      </w:r>
-    </w:p>
-    <w:p>
-      <w:pPr>
-        <w:pStyle w:val="ListBullet"/>
-      </w:pPr>
-      <w:r>
-        <w:t xml:space="preserve">  8. Auth Bypass &amp; Backdoor Account</w:t>
-      </w:r>
-    </w:p>
-    <w:p>
-      <w:pPr>
-        <w:pStyle w:val="ListBullet"/>
-      </w:pPr>
-      <w:r>
-        <w:t xml:space="preserve">  9. Information Disclosure</w:t>
-      </w:r>
-    </w:p>
-    <w:p>
-      <w:pPr>
-        <w:pStyle w:val="ListBullet"/>
-      </w:pPr>
-      <w:r>
-        <w:t xml:space="preserve">  10. Command Injection</w:t>
-      </w:r>
-    </w:p>
-    <w:p>
-      <w:pPr>
-        <w:pStyle w:val="ListBullet"/>
-      </w:pPr>
-      <w:r>
-        <w:t xml:space="preserve">  11. Buffer Overflow (Stack)</w:t>
-      </w:r>
-    </w:p>
-    <w:p>
-      <w:pPr>
-        <w:pStyle w:val="ListBullet"/>
-      </w:pPr>
-      <w:r>
-        <w:t xml:space="preserve">  12. CSRF &amp; XSS</w:t>
-      </w:r>
-    </w:p>
-    <w:p>
-      <w:pPr>
-        <w:pStyle w:val="ListBullet"/>
-      </w:pPr>
-      <w:r>
-        <w:t xml:space="preserve">  13. UPnP &amp; WPS</w:t>
-      </w:r>
-    </w:p>
-    <w:p>
-      <w:r>
-        <w:rPr>
-          <w:b/>
-        </w:rPr>
-        <w:t>BAGIAN IV — ANALISIS FIRMWARE</w:t>
-      </w:r>
-    </w:p>
-    <w:p>
-      <w:pPr>
-        <w:pStyle w:val="ListBullet"/>
-      </w:pPr>
-      <w:r>
-        <w:t xml:space="preserve">  14. Akuisisi Firmware</w:t>
-      </w:r>
-    </w:p>
-    <w:p>
-      <w:pPr>
-        <w:pStyle w:val="ListBullet"/>
-      </w:pPr>
-      <w:r>
-        <w:t xml:space="preserve">  15. Ekstraksi Firmware</w:t>
-      </w:r>
-    </w:p>
-    <w:p>
-      <w:pPr>
-        <w:pStyle w:val="ListBullet"/>
-      </w:pPr>
-      <w:r>
-        <w:t xml:space="preserve">  16. Analisis Filesystem</w:t>
-      </w:r>
-    </w:p>
-    <w:p>
-      <w:pPr>
-        <w:pStyle w:val="ListBullet"/>
-      </w:pPr>
-      <w:r>
-        <w:t xml:space="preserve">  17. Analisis Statis Binary</w:t>
-      </w:r>
-    </w:p>
-    <w:p>
-      <w:pPr>
-        <w:pStyle w:val="ListBullet"/>
-      </w:pPr>
-      <w:r>
-        <w:t xml:space="preserve">  18. Emulasi Firmware</w:t>
-      </w:r>
-    </w:p>
-    <w:p>
-      <w:r>
-        <w:rPr>
-          <w:b/>
-        </w:rPr>
-        <w:t>BAGIAN V — HARDWARE HACKING</w:t>
-      </w:r>
-    </w:p>
-    <w:p>
-      <w:pPr>
-        <w:pStyle w:val="ListBullet"/>
-      </w:pPr>
-      <w:r>
-        <w:t xml:space="preserve">  19. UART: Mendapatkan Console/Shell</w:t>
-      </w:r>
-    </w:p>
-    <w:p>
-      <w:pPr>
-        <w:pStyle w:val="ListBullet"/>
-      </w:pPr>
-      <w:r>
-        <w:t xml:space="preserve">  20. SPI Flash &amp; CH341A</w:t>
-      </w:r>
-    </w:p>
-    <w:p>
-      <w:pPr>
-        <w:pStyle w:val="ListBullet"/>
-      </w:pPr>
-      <w:r>
-        <w:t xml:space="preserve">  21. Secure Boot &amp; Glitch (konsep)</w:t>
-      </w:r>
-    </w:p>
-    <w:p>
-      <w:r>
-        <w:rPr>
-          <w:b/>
-        </w:rPr>
-        <w:t>BAGIAN VI — POLA &amp; PENUTUP</w:t>
-      </w:r>
-    </w:p>
-    <w:p>
-      <w:pPr>
-        <w:pStyle w:val="ListBullet"/>
-      </w:pPr>
-      <w:r>
-        <w:t xml:space="preserve">  22. Cheat Sheet Pola Celah</w:t>
-      </w:r>
-    </w:p>
-    <w:p>
-      <w:pPr>
-        <w:pStyle w:val="ListBullet"/>
-      </w:pPr>
-      <w:r>
-        <w:t xml:space="preserve">  23. Roadmap &amp; Latihan Lanjutan</w:t>
-      </w:r>
-    </w:p>
-    <w:p>
-      <w:pPr>
-        <w:pStyle w:val="ListBullet"/>
-      </w:pPr>
-      <w:r>
-        <w:t xml:space="preserve">  24. Glosarium</w:t>
-      </w:r>
-    </w:p>
-    <w:p>
-      <w:pPr>
-        <w:pStyle w:val="ListBullet"/>
-      </w:pPr>
-      <w:r>
-        <w:t>Lampiran A — Bukti Live Perangkat Anda</w:t>
+        <w:t>Bagian ini membangun fondasi langkah demi langkah — konsep hardware, firmware, dan IoT; metodologi pengujian; anatomi router; hingga pola kerentanan umum — memakai perangkat yang sama sebagai studi kasus.</w:t>
       </w:r>
     </w:p>
     <w:p>
@@ -817,11 +528,6 @@
         <w:jc w:val="center"/>
       </w:pPr>
       <w:r>
-        <w:rPr>
-          <w:i/>
-          <w:color w:val="555555"/>
-          <w:sz w:val="18"/>
-        </w:rPr>
         <w:t>Gambar 1. Lapisan permukaan serangan sebuah perangkat IoT.</w:t>
       </w:r>
     </w:p>
@@ -1033,11 +739,6 @@
         <w:jc w:val="center"/>
       </w:pPr>
       <w:r>
-        <w:rPr>
-          <w:i/>
-          <w:color w:val="555555"/>
-          <w:sz w:val="18"/>
-        </w:rPr>
         <w:t>Gambar 2. Lima tahap metodologi pengujian.</w:t>
       </w:r>
     </w:p>
@@ -1798,11 +1499,6 @@
         <w:jc w:val="center"/>
       </w:pPr>
       <w:r>
-        <w:rPr>
-          <w:i/>
-          <w:color w:val="555555"/>
-          <w:sz w:val="18"/>
-        </w:rPr>
         <w:t>Gambar 3. Hasil live: port terbuka + deteksi service.</w:t>
       </w:r>
     </w:p>
@@ -2103,11 +1799,6 @@
         <w:jc w:val="center"/>
       </w:pPr>
       <w:r>
-        <w:rPr>
-          <w:i/>
-          <w:color w:val="555555"/>
-          <w:sz w:val="18"/>
-        </w:rPr>
         <w:t>Gambar 4. Halaman WiFi Settings asli (UI live via sesi bypass).</w:t>
       </w:r>
     </w:p>
@@ -2324,11 +2015,6 @@
         <w:jc w:val="center"/>
       </w:pPr>
       <w:r>
-        <w:rPr>
-          <w:i/>
-          <w:color w:val="555555"/>
-          <w:sz w:val="18"/>
-        </w:rPr>
         <w:t>Gambar 5. Alur auth bypass pada perangkat ini.</w:t>
       </w:r>
     </w:p>
@@ -2433,11 +2119,6 @@
         <w:jc w:val="center"/>
       </w:pPr>
       <w:r>
-        <w:rPr>
-          <w:i/>
-          <w:color w:val="555555"/>
-          <w:sz w:val="18"/>
-        </w:rPr>
         <w:t>Gambar 6. Bukti live login bypass user:user.</w:t>
       </w:r>
     </w:p>
@@ -2648,11 +2329,6 @@
         <w:jc w:val="center"/>
       </w:pPr>
       <w:r>
-        <w:rPr>
-          <w:i/>
-          <w:color w:val="555555"/>
-          <w:sz w:val="18"/>
-        </w:rPr>
         <w:t>Gambar 7. /goform/WifiBasicGet membocorkan password WiFi (cleartext).</w:t>
       </w:r>
     </w:p>
@@ -2700,11 +2376,6 @@
         <w:jc w:val="center"/>
       </w:pPr>
       <w:r>
-        <w:rPr>
-          <w:i/>
-          <w:color w:val="555555"/>
-          <w:sz w:val="18"/>
-        </w:rPr>
         <w:t>Gambar 8. /goform/GetIpMacBind — daftar perangkat di jaringan.</w:t>
       </w:r>
     </w:p>
@@ -3679,11 +3350,6 @@
         <w:jc w:val="center"/>
       </w:pPr>
       <w:r>
-        <w:rPr>
-          <w:i/>
-          <w:color w:val="555555"/>
-          <w:sz w:val="18"/>
-        </w:rPr>
         <w:t>Gambar 9. WPS aktif dan PIN bocor (69043949).</w:t>
       </w:r>
     </w:p>
@@ -3750,11 +3416,6 @@
         <w:jc w:val="center"/>
       </w:pPr>
       <w:r>
-        <w:rPr>
-          <w:i/>
-          <w:color w:val="555555"/>
-          <w:sz w:val="18"/>
-        </w:rPr>
         <w:t>Gambar 10. Status fitur: UPnP &amp; cloud aktif, remote web mati.</w:t>
       </w:r>
     </w:p>
@@ -3823,11 +3484,6 @@
         <w:jc w:val="center"/>
       </w:pPr>
       <w:r>
-        <w:rPr>
-          <w:i/>
-          <w:color w:val="555555"/>
-          <w:sz w:val="18"/>
-        </w:rPr>
         <w:t>Gambar 11. Alur analisis firmware.</w:t>
       </w:r>
     </w:p>
@@ -6558,11 +6214,6 @@
       </w:r>
     </w:p>
     <w:p/>
-    <w:p/>
-    <w:p/>
-    <w:p/>
-    <w:p/>
-    <w:p/>
     <w:p>
       <w:pPr>
         <w:pStyle w:val="Heading1"/>
@@ -6594,49 +6245,6 @@
     <w:p>
       <w:r>
         <w:br w:type="page"/>
-      </w:r>
-    </w:p>
-    <w:p>
-      <w:pPr>
-        <w:pStyle w:val="Title"/>
-        <w:jc w:val="center"/>
-      </w:pPr>
-      <w:r>
-        <w:t>Buku Belajar — Volume 2</w:t>
-      </w:r>
-    </w:p>
-    <w:p>
-      <w:pPr>
-        <w:jc w:val="center"/>
-      </w:pPr>
-      <w:r>
-        <w:rPr>
-          <w:b/>
-          <w:sz w:val="34"/>
-        </w:rPr>
-        <w:t>Reverse Engineering &amp; Binary Exploitation</w:t>
-      </w:r>
-    </w:p>
-    <w:p>
-      <w:pPr>
-        <w:jc w:val="center"/>
-      </w:pPr>
-      <w:r>
-        <w:rPr>
-          <w:i/>
-        </w:rPr>
-        <w:t>Menemukan celah di dalam binary, lalu memahaminya sampai eksploitasi (MIPS &amp; ARM)</w:t>
-      </w:r>
-    </w:p>
-    <w:p>
-      <w:pPr>
-        <w:jc w:val="center"/>
-      </w:pPr>
-      <w:r>
-        <w:rPr>
-          <w:b/>
-        </w:rPr>
-        <w:t>Studi kasus: Tenda AC6 v2 — Realtek RTL8197F (MIPS 24Kc, little-endian)</w:t>
       </w:r>
     </w:p>
     <w:p/>
@@ -6839,226 +6447,7 @@
     </w:p>
     <w:p>
       <w:r>
-        <w:rPr>
-          <w:b/>
-        </w:rPr>
-        <w:t>BAGIAN A — FONDASI REVERSE ENGINEERING</w:t>
-      </w:r>
-    </w:p>
-    <w:p>
-      <w:r>
-        <w:rPr>
-          <w:b w:val="0"/>
-        </w:rPr>
-        <w:t xml:space="preserve">  1. Apa itu Reverse Engineering &amp; Mengapa Penting</w:t>
-      </w:r>
-    </w:p>
-    <w:p>
-      <w:r>
-        <w:rPr>
-          <w:b w:val="0"/>
-        </w:rPr>
-        <w:t xml:space="preserve">  2. Toolchain Reverse Engineering</w:t>
-      </w:r>
-    </w:p>
-    <w:p>
-      <w:r>
-        <w:rPr>
-          <w:b w:val="0"/>
-        </w:rPr>
-        <w:t xml:space="preserve">  3. ELF &amp; Arsitektur MIPS (register, calling convention, delay slot)</w:t>
-      </w:r>
-    </w:p>
-    <w:p>
-      <w:r>
-        <w:rPr>
-          <w:b w:val="0"/>
-        </w:rPr>
-        <w:t xml:space="preserve">  4. Perbandingan MIPS / ARM / x86</w:t>
-      </w:r>
-    </w:p>
-    <w:p>
-      <w:r>
-        <w:rPr>
-          <w:b/>
-        </w:rPr>
-        <w:t>BAGIAN B — RE UNTUK MENEMUKAN CELAH</w:t>
-      </w:r>
-    </w:p>
-    <w:p>
-      <w:r>
-        <w:rPr>
-          <w:b w:val="0"/>
-        </w:rPr>
-        <w:t xml:space="preserve">  5. Alur: Firmware -&gt; httpd -&gt; Webroot -&gt; XREF</w:t>
-      </w:r>
-    </w:p>
-    <w:p>
-      <w:r>
-        <w:rPr>
-          <w:b w:val="0"/>
-        </w:rPr>
-        <w:t xml:space="preserve">  6. Membaca Binary: file, readelf, nm, strings</w:t>
-      </w:r>
-    </w:p>
-    <w:p>
-      <w:r>
-        <w:rPr>
-          <w:b w:val="0"/>
-        </w:rPr>
-        <w:t xml:space="preserve">  7. Ghidra 101 (load, analyze, decompile, XREF)</w:t>
-      </w:r>
-    </w:p>
-    <w:p>
-      <w:r>
-        <w:rPr>
-          <w:b w:val="0"/>
-        </w:rPr>
-        <w:t xml:space="preserve">  8. Pola Celah di Decompiler (strcpy/sprintf/system/popen)</w:t>
-      </w:r>
-    </w:p>
-    <w:p>
-      <w:r>
-        <w:rPr>
-          <w:b w:val="0"/>
-        </w:rPr>
-        <w:t xml:space="preserve">  9. Menemukan Command Injection lewat RE</w:t>
-      </w:r>
-    </w:p>
-    <w:p>
-      <w:r>
-        <w:rPr>
-          <w:b w:val="0"/>
-        </w:rPr>
-        <w:t xml:space="preserve">  10. Menemukan Buffer Overflow lewat RE</w:t>
-      </w:r>
-    </w:p>
-    <w:p>
-      <w:r>
-        <w:rPr>
-          <w:b w:val="0"/>
-        </w:rPr>
-        <w:t xml:space="preserve">  11. Dynamic Analysis (QEMU-user + gdb-multiarch + strace)</w:t>
-      </w:r>
-    </w:p>
-    <w:p>
-      <w:r>
-        <w:rPr>
-          <w:b/>
-        </w:rPr>
-        <w:t>BAGIAN C — BINARY EXPLOITATION</w:t>
-      </w:r>
-    </w:p>
-    <w:p>
-      <w:r>
-        <w:rPr>
-          <w:b w:val="0"/>
-        </w:rPr>
-        <w:t xml:space="preserve">  12. Layout Memori Proses</w:t>
-      </w:r>
-    </w:p>
-    <w:p>
-      <w:r>
-        <w:rPr>
-          <w:b w:val="0"/>
-        </w:rPr>
-        <w:t xml:space="preserve">  13. Mekanika Stack Overflow</w:t>
-      </w:r>
-    </w:p>
-    <w:p>
-      <w:r>
-        <w:rPr>
-          <w:b w:val="0"/>
-        </w:rPr>
-        <w:t xml:space="preserve">  14. Eksploitasi MIPS: seluk-beluk</w:t>
-      </w:r>
-    </w:p>
-    <w:p>
-      <w:r>
-        <w:rPr>
-          <w:b w:val="0"/>
-        </w:rPr>
-        <w:t xml:space="preserve">  15. Eksploitasi ARM: seluk-beluk</w:t>
-      </w:r>
-    </w:p>
-    <w:p>
-      <w:r>
-        <w:rPr>
-          <w:b w:val="0"/>
-        </w:rPr>
-        <w:t xml:space="preserve">  16. Mitigasi Modern &amp; Kenyataan di Embedded</w:t>
-      </w:r>
-    </w:p>
-    <w:p>
-      <w:r>
-        <w:rPr>
-          <w:b w:val="0"/>
-        </w:rPr>
-        <w:t xml:space="preserve">  17. Teknik Kontrol Eksekusi: ret2libc, ROP, Shellcode</w:t>
-      </w:r>
-    </w:p>
-    <w:p>
-      <w:r>
-        <w:rPr>
-          <w:b w:val="0"/>
-        </w:rPr>
-        <w:t xml:space="preserve">  18. Menulis Exploit dengan pwntools</w:t>
-      </w:r>
-    </w:p>
-    <w:p>
-      <w:r>
-        <w:rPr>
-          <w:b w:val="0"/>
-        </w:rPr>
-        <w:t xml:space="preserve">  19. Emulasi &amp; Debug Exploit</w:t>
-      </w:r>
-    </w:p>
-    <w:p>
-      <w:r>
-        <w:rPr>
-          <w:b w:val="0"/>
-        </w:rPr>
-        <w:t xml:space="preserve">  20. Studi Kasus: CVE Tenda (formSet*, setaccount)</w:t>
-      </w:r>
-    </w:p>
-    <w:p>
-      <w:r>
-        <w:rPr>
-          <w:b/>
-        </w:rPr>
-        <w:t>BAGIAN D — PRAKTIK &amp; PENUTUP</w:t>
-      </w:r>
-    </w:p>
-    <w:p>
-      <w:r>
-        <w:rPr>
-          <w:b w:val="0"/>
-        </w:rPr>
-        <w:t xml:space="preserve">  21. Lab Bertahap</w:t>
-      </w:r>
-    </w:p>
-    <w:p>
-      <w:r>
-        <w:rPr>
-          <w:b w:val="0"/>
-        </w:rPr>
-        <w:t xml:space="preserve">  22. Catatan Nyata: Membongkar SquashFS Kustom Tenda</w:t>
-      </w:r>
-    </w:p>
-    <w:p>
-      <w:r>
-        <w:rPr>
-          <w:b w:val="0"/>
-        </w:rPr>
-        <w:t xml:space="preserve">  23. Cheat Sheet RE &amp; Exploitasi</w:t>
-      </w:r>
-    </w:p>
-    <w:p>
-      <w:r>
-        <w:rPr>
-          <w:b w:val="0"/>
-        </w:rPr>
-        <w:t xml:space="preserve">  24. Glosarium &amp; Referensi</w:t>
+        <w:t>Bagian ini masuk ke reverse engineering dan binary exploitation pada MIPS: membaca ELF, memakai Ghidra, mengenali pola celah di decompiler, hingga menulis dan men-debug eksploit di emulator.</w:t>
       </w:r>
     </w:p>
     <w:p>
@@ -7787,12 +7176,7 @@
         <w:jc w:val="center"/>
       </w:pPr>
       <w:r>
-        <w:rPr>
-          <w:i/>
-          <w:color w:val="555555"/>
-          <w:sz w:val="18"/>
-        </w:rPr>
-        <w:t>Gambar 1. Register &amp; calling convention MIPS (contoh dari kernel Anda).</w:t>
+        <w:t>Gambar 12. Register &amp; calling convention MIPS (contoh dari kernel Anda).</w:t>
       </w:r>
     </w:p>
     <w:p>
@@ -8380,12 +7764,7 @@
         <w:jc w:val="center"/>
       </w:pPr>
       <w:r>
-        <w:rPr>
-          <w:i/>
-          <w:color w:val="555555"/>
-          <w:sz w:val="18"/>
-        </w:rPr>
-        <w:t>Gambar 2. Alur dari firmware sampai menemukan celah.</w:t>
+        <w:t>Gambar 13. Alur dari firmware sampai menemukan celah.</w:t>
       </w:r>
     </w:p>
     <w:p>
@@ -9650,12 +9029,7 @@
         <w:jc w:val="center"/>
       </w:pPr>
       <w:r>
-        <w:rPr>
-          <w:i/>
-          <w:color w:val="555555"/>
-          <w:sz w:val="18"/>
-        </w:rPr>
-        <w:t>Gambar 3. Layout memori proses (embedded umumnya tanpa ASLR).</w:t>
+        <w:t>Gambar 14. Layout memori proses (embedded umumnya tanpa ASLR).</w:t>
       </w:r>
     </w:p>
     <w:p>
@@ -9782,12 +9156,7 @@
         <w:jc w:val="center"/>
       </w:pPr>
       <w:r>
-        <w:rPr>
-          <w:i/>
-          <w:color w:val="555555"/>
-          <w:sz w:val="18"/>
-        </w:rPr>
-        <w:t>Gambar 4. Input panjang menimpa buffer lalu saved return address.</w:t>
+        <w:t>Gambar 15. Input panjang menimpa buffer lalu saved return address.</w:t>
       </w:r>
     </w:p>
     <w:p>
@@ -11643,11 +11012,6 @@
       </w:r>
     </w:p>
     <w:p/>
-    <w:p/>
-    <w:p/>
-    <w:p/>
-    <w:p/>
-    <w:p/>
     <w:p>
       <w:pPr>
         <w:pStyle w:val="Heading1"/>
@@ -12082,12 +11446,7 @@
         <w:jc w:val="center"/>
       </w:pPr>
       <w:r>
-        <w:rPr>
-          <w:i/>
-          <w:color w:val="555555"/>
-          <w:sz w:val="18"/>
-        </w:rPr>
-        <w:t>Gambar 1. Template shell + aliran parameter ke doSystemCmd (formSetClientState/formSetSpeedWan).</w:t>
+        <w:t>Gambar 16. Template shell + aliran parameter ke doSystemCmd (formSetClientState/formSetSpeedWan).</w:t>
       </w:r>
     </w:p>
     <w:p>
@@ -12134,12 +11493,7 @@
         <w:jc w:val="center"/>
       </w:pPr>
       <w:r>
-        <w:rPr>
-          <w:i/>
-          <w:color w:val="555555"/>
-          <w:sz w:val="18"/>
-        </w:rPr>
-        <w:t>Gambar 2. Ghidra (live): formSetClientState() — parameter HTTP diproses di fungsi ini.</w:t>
+        <w:t>Gambar 17. Ghidra (live): formSetClientState() — parameter HTTP diproses di fungsi ini.</w:t>
       </w:r>
     </w:p>
     <w:p>
@@ -12186,12 +11540,7 @@
         <w:jc w:val="center"/>
       </w:pPr>
       <w:r>
-        <w:rPr>
-          <w:i/>
-          <w:color w:val="555555"/>
-          <w:sz w:val="18"/>
-        </w:rPr>
-        <w:t>Gambar 3. Ghidra (live): formSetSpeedWan() — memanggil doSystemCmd().</w:t>
+        <w:t>Gambar 18. Ghidra (live): formSetSpeedWan() — memanggil doSystemCmd().</w:t>
       </w:r>
     </w:p>
     <w:p>
@@ -12784,11 +12133,6 @@
       </w:r>
     </w:p>
     <w:p/>
-    <w:p/>
-    <w:p/>
-    <w:p/>
-    <w:p/>
-    <w:p/>
     <w:p>
       <w:pPr>
         <w:pStyle w:val="Heading1"/>
@@ -13371,11 +12715,6 @@
         <w:t>Siapkan selalu firmware resmi + mode recovery + (ideal) UART sebelum sentuh hardware.</w:t>
       </w:r>
     </w:p>
-    <w:p/>
-    <w:p/>
-    <w:p/>
-    <w:p/>
-    <w:p/>
     <w:p/>
     <w:p>
       <w:pPr>
@@ -13749,12 +13088,7 @@
     <w:p/>
     <w:p>
       <w:r>
-        <w:rPr>
-          <w:i/>
-          <w:color w:val="555555"/>
-          <w:sz w:val="20"/>
-        </w:rPr>
-        <w:t>Offset teoretis 748 tidak pernah diuji bersih: pada N≥600 koneksi sudah drop lebih dulu. Artinya ada batas lain (parser/commit/intermediate buffer) sebelum saved $ra tercapai.</w:t>
+        <w:t>Offset 748 terkonfirmasi dinamis: saved $ra terbaca 0x44434241 untuk masukan 'ABCD', lalu 0x005047c0 untuk alamat target — dan dipakai pada eksploit final yang menghasilkan root shell (lihat BAGIAN IV).</w:t>
       </w:r>
     </w:p>
     <w:p>
@@ -14396,11 +13730,6 @@
         <w:t>Jangan pernah menguji payload memori ke perangkat yang dipakai sehari-hari.</w:t>
       </w:r>
     </w:p>
-    <w:p/>
-    <w:p/>
-    <w:p/>
-    <w:p/>
-    <w:p/>
     <w:p/>
     <w:p>
       <w:pPr>
@@ -15159,11 +14488,6 @@
       </w:r>
     </w:p>
     <w:p/>
-    <w:p/>
-    <w:p/>
-    <w:p/>
-    <w:p/>
-    <w:p/>
     <w:p>
       <w:pPr>
         <w:pStyle w:val="Heading1"/>
@@ -15199,18 +14523,9 @@
     </w:p>
     <w:p>
       <w:pPr>
-        <w:pStyle w:val="Title"/>
         <w:jc w:val="center"/>
       </w:pPr>
       <w:r>
-        <w:t>Lampiran 2 — Di Mana Backdoor user:user Berada (RE httpd Tenda asli)</w:t>
-      </w:r>
-    </w:p>
-    <w:p>
-      <w:pPr>
-        <w:jc w:val="center"/>
-      </w:pPr>
-      <w:r>
         <w:rPr>
           <w:b/>
         </w:rPr>
@@ -15228,34 +14543,7 @@
     </w:p>
     <w:p>
       <w:r>
-        <w:rPr>
-          <w:b w:val="0"/>
-        </w:rPr>
-        <w:t xml:space="preserve">Firmware AC6 v2 Anda memakai </w:t>
-      </w:r>
-      <w:r>
-        <w:rPr>
-          <w:b/>
-        </w:rPr>
-        <w:t>SquashFS kustom/terenkripsi</w:t>
-      </w:r>
-      <w:r>
-        <w:rPr>
-          <w:b w:val="0"/>
-        </w:rPr>
-        <w:t xml:space="preserve"> (tiap blok ber-marker `Tenda\0\0\1`, tidak ada magic xz, dan tidak ada codec standar yang cocok) sehingga rootfs-nya tidak bisa diekstrak cepat. </w:t>
-      </w:r>
-      <w:r>
-        <w:rPr>
-          <w:b/>
-        </w:rPr>
-        <w:t>Tapi</w:t>
-      </w:r>
-      <w:r>
-        <w:rPr>
-          <w:b w:val="0"/>
-        </w:rPr>
-        <w:t xml:space="preserve"> httpd Tenda generasi sama sudah di-ekstrak publik. Kita ambil dari repositori GitHub (rootfs hasil ekstrak), lalu menganalisis binary-nya di Ghidra.</w:t>
+        <w:t>Koreksi arsip: rootfs pada buku ini diekstrak dari firmware perangkat sendiri, dan biner httpd yang dianalisis adalah biner asli perangkat tersebut (lihat firmware/httpd di repo) — bukan dari repositori publik.</w:t>
       </w:r>
     </w:p>
     <w:tbl>
@@ -15558,12 +14846,7 @@
         <w:jc w:val="center"/>
       </w:pPr>
       <w:r>
-        <w:rPr>
-          <w:i/>
-          <w:color w:val="555555"/>
-          <w:sz w:val="18"/>
-        </w:rPr>
-        <w:t>Gambar 1. Ghidra (live): fromSysToolBaseUser membaca GetValue("sys.baseusername")/"sys.baseuserpass".</w:t>
+        <w:t>Gambar 19. Ghidra (live): fromSysToolBaseUser membaca GetValue("sys.baseusername")/"sys.baseuserpass".</w:t>
       </w:r>
     </w:p>
     <w:p>
@@ -15626,12 +14909,7 @@
         <w:jc w:val="center"/>
       </w:pPr>
       <w:r>
-        <w:rPr>
-          <w:i/>
-          <w:color w:val="555555"/>
-          <w:sz w:val="18"/>
-        </w:rPr>
-        <w:t>Gambar 2. Ghidra (live): R7WebsSecurityHandler — gerbang auth web server.</w:t>
+        <w:t>Gambar 20. Ghidra (live): R7WebsSecurityHandler — gerbang auth web server.</w:t>
       </w:r>
     </w:p>
     <w:p>
@@ -15694,12 +14972,7 @@
         <w:jc w:val="center"/>
       </w:pPr>
       <w:r>
-        <w:rPr>
-          <w:i/>
-          <w:color w:val="555555"/>
-          <w:sz w:val="18"/>
-        </w:rPr>
-        <w:t>Gambar 3. Ghidra (live): string s_/login/Auth_000dc2a0 + XREF.</w:t>
+        <w:t>Gambar 21. Ghidra (live): string s_/login/Auth_000dc2a0 + XREF.</w:t>
       </w:r>
     </w:p>
     <w:p>
@@ -15897,11 +15170,6 @@
       </w:r>
     </w:p>
     <w:p/>
-    <w:p/>
-    <w:p/>
-    <w:p/>
-    <w:p/>
-    <w:p/>
     <w:p>
       <w:pPr>
         <w:pStyle w:val="Heading1"/>
@@ -15933,15 +15201,6 @@
     <w:p>
       <w:r>
         <w:br w:type="page"/>
-      </w:r>
-    </w:p>
-    <w:p>
-      <w:pPr>
-        <w:pStyle w:val="Title"/>
-        <w:jc w:val="center"/>
-      </w:pPr>
-      <w:r>
-        <w:t>Lampiran Live — Sesi RE &amp; Binary Exploitation Nyata</w:t>
       </w:r>
     </w:p>
     <w:p>
@@ -16273,12 +15532,7 @@
     <w:p/>
     <w:p>
       <w:r>
-        <w:rPr>
-          <w:i/>
-          <w:color w:val="555555"/>
-          <w:sz w:val="20"/>
-        </w:rPr>
-        <w:t>Catatan: karena firmware Tenda memakai SquashFS kustom (tidak bisa diekstrak tool umum), binary target httpd-nya belum tersedia. Untuk tetap menghadirkan sesi LIVE, kita merakit binary MIPS yang sengaja rentan (arsitektur identik: MIPS32 LE) sehingga proses RE dan eksploitasi bisa diperlihatkan utuh dan jujur.</w:t>
+        <w:t>Koreksi: biner target httpd asli TELAH tersedia dan dipakai langsung (lihat firmware/httpd di repo). Biner latihan MIPS32 hanya pelengkap pedagogis; seluruh temuan diverifikasi pada biner nyata.</w:t>
       </w:r>
     </w:p>
     <w:p>
@@ -16507,12 +15761,7 @@
         <w:jc w:val="center"/>
       </w:pPr>
       <w:r>
-        <w:rPr>
-          <w:i/>
-          <w:color w:val="555555"/>
-          <w:sz w:val="18"/>
-        </w:rPr>
-        <w:t>Gambar 1. Cutter: dashboard binary. Perhatikan PIE/Canary/NX = False, Endianness LE, arch MIPS.</w:t>
+        <w:t>Gambar 22. Cutter: dashboard binary. Perhatikan PIE/Canary/NX = False, Endianness LE, arch MIPS.</w:t>
       </w:r>
     </w:p>
     <w:p>
@@ -16579,12 +15828,7 @@
         <w:jc w:val="center"/>
       </w:pPr>
       <w:r>
-        <w:rPr>
-          <w:i/>
-          <w:color w:val="555555"/>
-          <w:sz w:val="18"/>
-        </w:rPr>
-        <w:t>Gambar 2. Cutter (rizin): disassembly MIPS + anotasi lokal (local_4, syscall.read, done, win).</w:t>
+        <w:t>Gambar 23. Cutter (rizin): disassembly MIPS + anotasi lokal (local_4, syscall.read, done, win).</w:t>
       </w:r>
     </w:p>
     <w:p>
@@ -16696,12 +15940,7 @@
         <w:jc w:val="center"/>
       </w:pPr>
       <w:r>
-        <w:rPr>
-          <w:i/>
-          <w:color w:val="555555"/>
-          <w:sz w:val="18"/>
-        </w:rPr>
-        <w:t>Gambar 3. Ghidra CodeBrowser: Listing MIPS (kiri) + Decompiler (kanan) + Symbol/Program Tree.</w:t>
+        <w:t>Gambar 24. Ghidra CodeBrowser: Listing MIPS (kiri) + Decompiler (kanan) + Symbol/Program Tree.</w:t>
       </w:r>
     </w:p>
     <w:p>
@@ -16878,12 +16117,7 @@
         <w:jc w:val="center"/>
       </w:pPr>
       <w:r>
-        <w:rPr>
-          <w:i/>
-          <w:color w:val="555555"/>
-          <w:sz w:val="18"/>
-        </w:rPr>
-        <w:t>Gambar 4. GDB (GEF) LIVE: $pc = $ra = 0x41414141 ('AAAA'), SIGSEGV di alamat pilihan kita.</w:t>
+        <w:t>Gambar 25. GDB (GEF) LIVE: $pc = $ra = 0x41414141 ('AAAA'), SIGSEGV di alamat pilihan kita.</w:t>
       </w:r>
     </w:p>
     <w:p>
@@ -16946,12 +16180,7 @@
         <w:jc w:val="center"/>
       </w:pPr>
       <w:r>
-        <w:rPr>
-          <w:i/>
-          <w:color w:val="555555"/>
-          <w:sz w:val="18"/>
-        </w:rPr>
-        <w:t>Gambar 5. GDB LIVE: $ra = 0x00400140 &lt;win+0&gt;, $pc = 0x00400144 &lt;win+4&gt;; eksekusi dibajak.</w:t>
+        <w:t>Gambar 26. GDB LIVE: $ra = 0x00400140 &lt;win+0&gt;, $pc = 0x00400144 &lt;win+4&gt;; eksekusi dibajak.</w:t>
       </w:r>
     </w:p>
     <w:p>
@@ -17274,15 +16503,12 @@
         <w:pStyle w:val="Heading4"/>
       </w:pPr>
       <w:r>
-        <w:t>5.1 Kendala &amp; langkah berikutnya</w:t>
-      </w:r>
-    </w:p>
-    <w:p>
-      <w:r>
-        <w:rPr>
-          <w:b w:val="0"/>
-        </w:rPr>
-        <w:t>Firmware Tenda AC6 v2 memakai SquashFS kustom (tiap blok ber-marker `Tenda\0\0\1`, tanpa magic xz standar), sehingga `unsquashfs`/`sasquatch`/7z gagal. Artinya `httpd` asli belum berhasil diekstrak. Untuk melanjutkan ke target nyata:</w:t>
+        <w:t>5.1 Status: selesai (dipetakan &amp; dibuktikan)</w:t>
+      </w:r>
+    </w:p>
+    <w:p>
+      <w:r>
+        <w:t>Koreksi: `httpd` asli SUDAH berhasil diekstrak (lihat firmware/httpd di repo) dan dipakai untuk seluruh analisis berikutnya.</w:t>
       </w:r>
     </w:p>
     <w:p>
@@ -17375,11 +16601,6 @@
         <w:t>Seluruh screenshot di dokumen ini diambil dari sesi nyata di mesin lokal (Xvfb) pada perangkat lab. Gunakan hanya untuk perangkat milik sendiri.</w:t>
       </w:r>
     </w:p>
-    <w:p/>
-    <w:p/>
-    <w:p/>
-    <w:p/>
-    <w:p/>
     <w:p/>
     <w:p>
       <w:pPr>

</xml_diff>

<commit_message>
book: tambah halaman sampul (judul, subjudul, penulis, edisi)
</commit_message>
<xml_diff>
--- a/book/BUKU-LENGKAP-Hardware-Firmware-IoT-Hacking.docx
+++ b/book/BUKU-LENGKAP-Hardware-Firmware-IoT-Hacking.docx
@@ -2,6 +2,98 @@
 <file path=word/document.xml><?xml version="1.0" encoding="utf-8"?>
 <w:document xmlns:wpc="http://schemas.microsoft.com/office/word/2010/wordprocessingCanvas" xmlns:mo="http://schemas.microsoft.com/office/mac/office/2008/main" xmlns:mc="http://schemas.openxmlformats.org/markup-compatibility/2006" xmlns:mv="urn:schemas-microsoft-com:mac:vml" xmlns:o="urn:schemas-microsoft-com:office:office" xmlns:r="http://schemas.openxmlformats.org/officeDocument/2006/relationships" xmlns:m="http://schemas.openxmlformats.org/officeDocument/2006/math" xmlns:v="urn:schemas-microsoft-com:vml" xmlns:wp14="http://schemas.microsoft.com/office/word/2010/wordprocessingDrawing" xmlns:wp="http://schemas.openxmlformats.org/drawingml/2006/wordprocessingDrawing" xmlns:w10="urn:schemas-microsoft-com:office:word" xmlns:w="http://schemas.openxmlformats.org/wordprocessingml/2006/main" xmlns:w14="http://schemas.microsoft.com/office/word/2010/wordml" xmlns:wpg="http://schemas.microsoft.com/office/word/2010/wordprocessingGroup" xmlns:wpi="http://schemas.microsoft.com/office/word/2010/wordprocessingInk" xmlns:wne="http://schemas.microsoft.com/office/word/2006/wordml" xmlns:wps="http://schemas.microsoft.com/office/word/2010/wordprocessingShape" mc:Ignorable="w14 wp14">
   <w:body>
+    <w:p>
+      <w:pPr>
+        <w:spacing w:after="1440"/>
+      </w:pPr>
+    </w:p>
+    <w:p>
+      <w:pPr>
+        <w:spacing w:after="360"/>
+        <w:jc w:val="center"/>
+      </w:pPr>
+      <w:r>
+        <w:rPr>
+          <w:b/>
+          <w:color w:val="555555"/>
+          <w:sz w:val="24"/>
+        </w:rPr>
+        <w:t>STUDI KASUS KEAMANAN PERANGKAT IOT</w:t>
+      </w:r>
+    </w:p>
+    <w:p>
+      <w:pPr>
+        <w:spacing w:after="200"/>
+        <w:jc w:val="center"/>
+      </w:pPr>
+      <w:r>
+        <w:rPr>
+          <w:b/>
+          <w:color w:val="7A0D0D"/>
+          <w:sz w:val="64"/>
+        </w:rPr>
+        <w:t>Belajar Hardware, Firmware &amp; IoT Hacking</w:t>
+      </w:r>
+    </w:p>
+    <w:p>
+      <w:pPr>
+        <w:spacing w:after="160"/>
+        <w:jc w:val="center"/>
+      </w:pPr>
+      <w:r>
+        <w:rPr>
+          <w:b/>
+          <w:color w:val="222222"/>
+          <w:sz w:val="32"/>
+        </w:rPr>
+        <w:t>Dari Reconnaissance sampai Root Shell</w:t>
+      </w:r>
+    </w:p>
+    <w:p>
+      <w:pPr>
+        <w:spacing w:after="960"/>
+        <w:jc w:val="center"/>
+      </w:pPr>
+      <w:r>
+        <w:rPr>
+          <w:color w:val="555555"/>
+          <w:sz w:val="24"/>
+        </w:rPr>
+        <w:t>Studi Kasus: Router Tenda AC6 v2 — Emulasi Terisolasi &amp; Eksploitasi Nyata</w:t>
+      </w:r>
+    </w:p>
+    <w:p>
+      <w:pPr>
+        <w:spacing w:after="120"/>
+        <w:jc w:val="center"/>
+      </w:pPr>
+      <w:r>
+        <w:rPr>
+          <w:b/>
+          <w:color w:val="222222"/>
+          <w:sz w:val="28"/>
+        </w:rPr>
+        <w:t>Farrel</w:t>
+      </w:r>
+    </w:p>
+    <w:p>
+      <w:pPr>
+        <w:spacing w:after="0"/>
+        <w:jc w:val="center"/>
+      </w:pPr>
+      <w:r>
+        <w:rPr>
+          <w:color w:val="555555"/>
+          <w:sz w:val="22"/>
+        </w:rPr>
+        <w:t>Oktober 2026  •  Edisi 1.0</w:t>
+      </w:r>
+    </w:p>
+    <w:p>
+      <w:r>
+        <w:br w:type="page"/>
+      </w:r>
+    </w:p>
     <w:p/>
     <w:p>
       <w:pPr>

</xml_diff>